<commit_message>
Portfolio: Add GPU performance achievement to Rhinotales CV
</commit_message>
<xml_diff>
--- a/Kenan_Ibragimov_Unity_Developer.docx
+++ b/Kenan_Ibragimov_Unity_Developer.docx
@@ -727,6 +727,31 @@
           <w:color w:val="171A21"/>
           <w:sz w:val="17"/>
         </w:rPr>
+        <w:t xml:space="preserve">GPU rendering: </w:t>
+      </w:r>
+      <w:r>
+        <w:rPr>
+          <w:rFonts w:ascii="Arial" w:hAnsi="Arial"/>
+          <w:color w:val="171A21"/>
+          <w:sz w:val="17"/>
+        </w:rPr>
+        <w:t>Doubled FPS from 35 to 65-70 in affected scenes by optimizing URP shaders, decals and smoke.</w:t>
+      </w:r>
+    </w:p>
+    <w:p>
+      <w:pPr>
+        <w:pStyle w:val="ListBullet"/>
+        <w:keepLines/>
+        <w:spacing w:before="0" w:after="48" w:line="250" w:lineRule="auto"/>
+        <w:ind w:left="288" w:hanging="173"/>
+      </w:pPr>
+      <w:r>
+        <w:rPr>
+          <w:rFonts w:ascii="Arial" w:hAnsi="Arial"/>
+          <w:b/>
+          <w:color w:val="171A21"/>
+          <w:sz w:val="17"/>
+        </w:rPr>
         <w:t xml:space="preserve">Build &amp; delivery: </w:t>
       </w:r>
       <w:r>

</xml_diff>